<commit_message>
SP: finished requirements.txt. Added comments and made a little clean-up. Nothing major.
</commit_message>
<xml_diff>
--- a/report/report.docx
+++ b/report/report.docx
@@ -452,7 +452,7 @@
                 <w:noProof/>
                 <w:webHidden/>
               </w:rPr>
-              <w:t>3</w:t>
+              <w:t>2</w:t>
             </w:r>
             <w:r>
               <w:rPr>
@@ -544,7 +544,7 @@
                 <w:noProof/>
                 <w:webHidden/>
               </w:rPr>
-              <w:t>4</w:t>
+              <w:t>3</w:t>
             </w:r>
             <w:r>
               <w:rPr>
@@ -636,7 +636,7 @@
                 <w:noProof/>
                 <w:webHidden/>
               </w:rPr>
-              <w:t>5</w:t>
+              <w:t>4</w:t>
             </w:r>
             <w:r>
               <w:rPr>
@@ -752,11 +752,19 @@
           <w:lang w:val="en-US"/>
         </w:rPr>
       </w:pPr>
-      <w:r>
-        <w:rPr>
-          <w:lang w:val="en-US"/>
-        </w:rPr>
-        <w:t>Generate goal state</w:t>
+      <w:proofErr w:type="gramStart"/>
+      <w:r>
+        <w:rPr>
+          <w:lang w:val="en-US"/>
+        </w:rPr>
+        <w:t>Generate</w:t>
+      </w:r>
+      <w:proofErr w:type="gramEnd"/>
+      <w:r>
+        <w:rPr>
+          <w:lang w:val="en-US"/>
+        </w:rPr>
+        <w:t xml:space="preserve"> goal state</w:t>
       </w:r>
     </w:p>
     <w:p>
@@ -884,12 +892,14 @@
         </w:rPr>
         <w:t xml:space="preserve"> </w:t>
       </w:r>
+      <w:proofErr w:type="gramStart"/>
       <w:r>
         <w:rPr>
           <w:lang w:val="en-US"/>
         </w:rPr>
         <w:t>heuristics</w:t>
       </w:r>
+      <w:proofErr w:type="gramEnd"/>
     </w:p>
     <w:p>
       <w:pPr>
@@ -930,8 +940,16 @@
         <w:rPr>
           <w:lang w:val="en-US"/>
         </w:rPr>
-        <w:t>for each heuristics</w:t>
-      </w:r>
+        <w:t xml:space="preserve">for each </w:t>
+      </w:r>
+      <w:proofErr w:type="gramStart"/>
+      <w:r>
+        <w:rPr>
+          <w:lang w:val="en-US"/>
+        </w:rPr>
+        <w:t>heuristics</w:t>
+      </w:r>
+      <w:proofErr w:type="gramEnd"/>
     </w:p>
     <w:p>
       <w:pPr>
@@ -1074,7 +1092,7 @@
           </w:rPr>
           <w:id w:val="-1328291118"/>
           <w14:checkbox>
-            <w14:checked w14:val="0"/>
+            <w14:checked w14:val="1"/>
             <w14:checkedState w14:val="2612" w14:font="MS Gothic"/>
             <w14:uncheckedState w14:val="2610" w14:font="MS Gothic"/>
           </w14:checkbox>
@@ -1085,7 +1103,7 @@
               <w:rFonts w:ascii="MS Gothic" w:eastAsia="MS Gothic" w:hAnsi="MS Gothic" w:hint="eastAsia"/>
               <w:lang w:val="en-US"/>
             </w:rPr>
-            <w:t>☐</w:t>
+            <w:t>☒</w:t>
           </w:r>
         </w:sdtContent>
       </w:sdt>
@@ -1095,6 +1113,7 @@
         </w:rPr>
         <w:t xml:space="preserve">Setup Python-Version </w:t>
       </w:r>
+      <w:proofErr w:type="gramStart"/>
       <w:r>
         <w:rPr>
           <w:lang w:val="en-US"/>
@@ -1105,16 +1124,9 @@
         <w:rPr>
           <w:lang w:val="en-US"/>
         </w:rPr>
-        <w:t xml:space="preserve"> .</w:t>
-      </w:r>
-      <w:proofErr w:type="spellStart"/>
-      <w:r>
-        <w:rPr>
-          <w:lang w:val="en-US"/>
-        </w:rPr>
-        <w:t>venv</w:t>
-      </w:r>
-      <w:proofErr w:type="spellEnd"/>
+        <w:t xml:space="preserve"> .venv</w:t>
+      </w:r>
+      <w:proofErr w:type="gramEnd"/>
     </w:p>
     <w:p>
       <w:pPr>
@@ -1131,7 +1143,7 @@
           </w:rPr>
           <w:id w:val="772365154"/>
           <w14:checkbox>
-            <w14:checked w14:val="0"/>
+            <w14:checked w14:val="1"/>
             <w14:checkedState w14:val="2612" w14:font="MS Gothic"/>
             <w14:uncheckedState w14:val="2610" w14:font="MS Gothic"/>
           </w14:checkbox>
@@ -1142,7 +1154,7 @@
               <w:rFonts w:ascii="MS Gothic" w:eastAsia="MS Gothic" w:hAnsi="MS Gothic" w:hint="eastAsia"/>
               <w:lang w:val="en-US"/>
             </w:rPr>
-            <w:t>☐</w:t>
+            <w:t>☒</w:t>
           </w:r>
         </w:sdtContent>
       </w:sdt>
@@ -1168,7 +1180,7 @@
           </w:rPr>
           <w:id w:val="-513601416"/>
           <w14:checkbox>
-            <w14:checked w14:val="0"/>
+            <w14:checked w14:val="1"/>
             <w14:checkedState w14:val="2612" w14:font="MS Gothic"/>
             <w14:uncheckedState w14:val="2610" w14:font="MS Gothic"/>
           </w14:checkbox>
@@ -1179,7 +1191,7 @@
               <w:rFonts w:ascii="MS Gothic" w:eastAsia="MS Gothic" w:hAnsi="MS Gothic" w:hint="eastAsia"/>
               <w:lang w:val="en-US"/>
             </w:rPr>
-            <w:t>☐</w:t>
+            <w:t>☒</w:t>
           </w:r>
         </w:sdtContent>
       </w:sdt>
@@ -1223,7 +1235,7 @@
           </w:rPr>
           <w:id w:val="-285510658"/>
           <w14:checkbox>
-            <w14:checked w14:val="0"/>
+            <w14:checked w14:val="1"/>
             <w14:checkedState w14:val="2612" w14:font="MS Gothic"/>
             <w14:uncheckedState w14:val="2610" w14:font="MS Gothic"/>
           </w14:checkbox>
@@ -1234,7 +1246,7 @@
               <w:rFonts w:ascii="MS Gothic" w:eastAsia="MS Gothic" w:hAnsi="MS Gothic" w:hint="eastAsia"/>
               <w:lang w:val="en-US"/>
             </w:rPr>
-            <w:t>☐</w:t>
+            <w:t>☒</w:t>
           </w:r>
         </w:sdtContent>
       </w:sdt>
@@ -1260,7 +1272,7 @@
           </w:rPr>
           <w:id w:val="-1470663145"/>
           <w14:checkbox>
-            <w14:checked w14:val="0"/>
+            <w14:checked w14:val="1"/>
             <w14:checkedState w14:val="2612" w14:font="MS Gothic"/>
             <w14:uncheckedState w14:val="2610" w14:font="MS Gothic"/>
           </w14:checkbox>
@@ -1271,7 +1283,7 @@
               <w:rFonts w:ascii="MS Gothic" w:eastAsia="MS Gothic" w:hAnsi="MS Gothic" w:hint="eastAsia"/>
               <w:lang w:val="en-US"/>
             </w:rPr>
-            <w:t>☐</w:t>
+            <w:t>☒</w:t>
           </w:r>
         </w:sdtContent>
       </w:sdt>
@@ -1315,7 +1327,7 @@
           </w:rPr>
           <w:id w:val="-1110889122"/>
           <w14:checkbox>
-            <w14:checked w14:val="0"/>
+            <w14:checked w14:val="1"/>
             <w14:checkedState w14:val="2612" w14:font="MS Gothic"/>
             <w14:uncheckedState w14:val="2610" w14:font="MS Gothic"/>
           </w14:checkbox>
@@ -1326,7 +1338,7 @@
               <w:rFonts w:ascii="MS Gothic" w:eastAsia="MS Gothic" w:hAnsi="MS Gothic" w:hint="eastAsia"/>
               <w:lang w:val="en-US"/>
             </w:rPr>
-            <w:t>☐</w:t>
+            <w:t>☒</w:t>
           </w:r>
         </w:sdtContent>
       </w:sdt>
@@ -1334,7 +1346,7 @@
         <w:rPr>
           <w:lang w:val="en-US"/>
         </w:rPr>
-        <w:t>Hamming (misplaced tiles)</w:t>
+        <w:t xml:space="preserve">Hamming </w:t>
       </w:r>
     </w:p>
     <w:p>
@@ -1352,7 +1364,7 @@
           </w:rPr>
           <w:id w:val="2019891531"/>
           <w14:checkbox>
-            <w14:checked w14:val="0"/>
+            <w14:checked w14:val="1"/>
             <w14:checkedState w14:val="2612" w14:font="MS Gothic"/>
             <w14:uncheckedState w14:val="2610" w14:font="MS Gothic"/>
           </w14:checkbox>
@@ -1363,7 +1375,7 @@
               <w:rFonts w:ascii="MS Gothic" w:eastAsia="MS Gothic" w:hAnsi="MS Gothic" w:hint="eastAsia"/>
               <w:lang w:val="en-US"/>
             </w:rPr>
-            <w:t>☐</w:t>
+            <w:t>☒</w:t>
           </w:r>
         </w:sdtContent>
       </w:sdt>
@@ -1389,7 +1401,7 @@
           </w:rPr>
           <w:id w:val="-1235093247"/>
           <w14:checkbox>
-            <w14:checked w14:val="0"/>
+            <w14:checked w14:val="1"/>
             <w14:checkedState w14:val="2612" w14:font="MS Gothic"/>
             <w14:uncheckedState w14:val="2610" w14:font="MS Gothic"/>
           </w14:checkbox>
@@ -1400,7 +1412,7 @@
               <w:rFonts w:ascii="MS Gothic" w:eastAsia="MS Gothic" w:hAnsi="MS Gothic" w:hint="eastAsia"/>
               <w:lang w:val="en-US"/>
             </w:rPr>
-            <w:t>☐</w:t>
+            <w:t>☒</w:t>
           </w:r>
         </w:sdtContent>
       </w:sdt>
@@ -1444,7 +1456,7 @@
           </w:rPr>
           <w:id w:val="-645286919"/>
           <w14:checkbox>
-            <w14:checked w14:val="0"/>
+            <w14:checked w14:val="1"/>
             <w14:checkedState w14:val="2612" w14:font="MS Gothic"/>
             <w14:uncheckedState w14:val="2610" w14:font="MS Gothic"/>
           </w14:checkbox>
@@ -1455,7 +1467,7 @@
               <w:rFonts w:ascii="MS Gothic" w:eastAsia="MS Gothic" w:hAnsi="MS Gothic" w:hint="eastAsia"/>
               <w:lang w:val="en-US"/>
             </w:rPr>
-            <w:t>☐</w:t>
+            <w:t>☒</w:t>
           </w:r>
         </w:sdtContent>
       </w:sdt>
@@ -1481,7 +1493,7 @@
           </w:rPr>
           <w:id w:val="-1595163239"/>
           <w14:checkbox>
-            <w14:checked w14:val="0"/>
+            <w14:checked w14:val="1"/>
             <w14:checkedState w14:val="2612" w14:font="MS Gothic"/>
             <w14:uncheckedState w14:val="2610" w14:font="MS Gothic"/>
           </w14:checkbox>
@@ -1492,7 +1504,7 @@
               <w:rFonts w:ascii="MS Gothic" w:eastAsia="MS Gothic" w:hAnsi="MS Gothic" w:hint="eastAsia"/>
               <w:lang w:val="en-US"/>
             </w:rPr>
-            <w:t>☐</w:t>
+            <w:t>☒</w:t>
           </w:r>
         </w:sdtContent>
       </w:sdt>
@@ -1524,7 +1536,7 @@
           </w:rPr>
           <w:id w:val="-312792550"/>
           <w14:checkbox>
-            <w14:checked w14:val="0"/>
+            <w14:checked w14:val="1"/>
             <w14:checkedState w14:val="2612" w14:font="MS Gothic"/>
             <w14:uncheckedState w14:val="2610" w14:font="MS Gothic"/>
           </w14:checkbox>
@@ -1535,7 +1547,7 @@
               <w:rFonts w:ascii="MS Gothic" w:eastAsia="MS Gothic" w:hAnsi="MS Gothic" w:hint="eastAsia"/>
               <w:lang w:val="en-US"/>
             </w:rPr>
-            <w:t>☐</w:t>
+            <w:t>☒</w:t>
           </w:r>
         </w:sdtContent>
       </w:sdt>
@@ -1561,7 +1573,7 @@
           </w:rPr>
           <w:id w:val="1415286815"/>
           <w14:checkbox>
-            <w14:checked w14:val="0"/>
+            <w14:checked w14:val="1"/>
             <w14:checkedState w14:val="2612" w14:font="MS Gothic"/>
             <w14:uncheckedState w14:val="2610" w14:font="MS Gothic"/>
           </w14:checkbox>
@@ -1572,7 +1584,7 @@
               <w:rFonts w:ascii="MS Gothic" w:eastAsia="MS Gothic" w:hAnsi="MS Gothic" w:hint="eastAsia"/>
               <w:lang w:val="en-US"/>
             </w:rPr>
-            <w:t>☐</w:t>
+            <w:t>☒</w:t>
           </w:r>
         </w:sdtContent>
       </w:sdt>
@@ -1628,7 +1640,7 @@
           </w:rPr>
           <w:id w:val="1624969792"/>
           <w14:checkbox>
-            <w14:checked w14:val="0"/>
+            <w14:checked w14:val="1"/>
             <w14:checkedState w14:val="2612" w14:font="MS Gothic"/>
             <w14:uncheckedState w14:val="2610" w14:font="MS Gothic"/>
           </w14:checkbox>
@@ -1639,7 +1651,7 @@
               <w:rFonts w:ascii="MS Gothic" w:eastAsia="MS Gothic" w:hAnsi="MS Gothic" w:hint="eastAsia"/>
               <w:lang w:val="en-US"/>
             </w:rPr>
-            <w:t>☐</w:t>
+            <w:t>☒</w:t>
           </w:r>
         </w:sdtContent>
       </w:sdt>
@@ -1665,7 +1677,7 @@
           </w:rPr>
           <w:id w:val="-1288501547"/>
           <w14:checkbox>
-            <w14:checked w14:val="0"/>
+            <w14:checked w14:val="1"/>
             <w14:checkedState w14:val="2612" w14:font="MS Gothic"/>
             <w14:uncheckedState w14:val="2610" w14:font="MS Gothic"/>
           </w14:checkbox>
@@ -1676,7 +1688,7 @@
               <w:rFonts w:ascii="MS Gothic" w:eastAsia="MS Gothic" w:hAnsi="MS Gothic" w:hint="eastAsia"/>
               <w:lang w:val="en-US"/>
             </w:rPr>
-            <w:t>☐</w:t>
+            <w:t>☒</w:t>
           </w:r>
         </w:sdtContent>
       </w:sdt>
@@ -1702,7 +1714,7 @@
           </w:rPr>
           <w:id w:val="1993515892"/>
           <w14:checkbox>
-            <w14:checked w14:val="0"/>
+            <w14:checked w14:val="1"/>
             <w14:checkedState w14:val="2612" w14:font="MS Gothic"/>
             <w14:uncheckedState w14:val="2610" w14:font="MS Gothic"/>
           </w14:checkbox>
@@ -1713,7 +1725,7 @@
               <w:rFonts w:ascii="MS Gothic" w:eastAsia="MS Gothic" w:hAnsi="MS Gothic" w:hint="eastAsia"/>
               <w:lang w:val="en-US"/>
             </w:rPr>
-            <w:t>☐</w:t>
+            <w:t>☒</w:t>
           </w:r>
         </w:sdtContent>
       </w:sdt>
@@ -1739,7 +1751,7 @@
           </w:rPr>
           <w:id w:val="-1938905446"/>
           <w14:checkbox>
-            <w14:checked w14:val="0"/>
+            <w14:checked w14:val="1"/>
             <w14:checkedState w14:val="2612" w14:font="MS Gothic"/>
             <w14:uncheckedState w14:val="2610" w14:font="MS Gothic"/>
           </w14:checkbox>
@@ -1750,7 +1762,7 @@
               <w:rFonts w:ascii="MS Gothic" w:eastAsia="MS Gothic" w:hAnsi="MS Gothic" w:hint="eastAsia"/>
               <w:lang w:val="en-US"/>
             </w:rPr>
-            <w:t>☐</w:t>
+            <w:t>☒</w:t>
           </w:r>
         </w:sdtContent>
       </w:sdt>
@@ -1794,7 +1806,7 @@
           </w:rPr>
           <w:id w:val="-1003514672"/>
           <w14:checkbox>
-            <w14:checked w14:val="0"/>
+            <w14:checked w14:val="1"/>
             <w14:checkedState w14:val="2612" w14:font="MS Gothic"/>
             <w14:uncheckedState w14:val="2610" w14:font="MS Gothic"/>
           </w14:checkbox>
@@ -1805,7 +1817,7 @@
               <w:rFonts w:ascii="MS Gothic" w:eastAsia="MS Gothic" w:hAnsi="MS Gothic" w:hint="eastAsia"/>
               <w:lang w:val="en-US"/>
             </w:rPr>
-            <w:t>☐</w:t>
+            <w:t>☒</w:t>
           </w:r>
         </w:sdtContent>
       </w:sdt>
@@ -1831,7 +1843,7 @@
           </w:rPr>
           <w:id w:val="322548487"/>
           <w14:checkbox>
-            <w14:checked w14:val="0"/>
+            <w14:checked w14:val="1"/>
             <w14:checkedState w14:val="2612" w14:font="MS Gothic"/>
             <w14:uncheckedState w14:val="2610" w14:font="MS Gothic"/>
           </w14:checkbox>
@@ -1842,7 +1854,7 @@
               <w:rFonts w:ascii="MS Gothic" w:eastAsia="MS Gothic" w:hAnsi="MS Gothic" w:hint="eastAsia"/>
               <w:lang w:val="en-US"/>
             </w:rPr>
-            <w:t>☐</w:t>
+            <w:t>☒</w:t>
           </w:r>
         </w:sdtContent>
       </w:sdt>
@@ -1886,7 +1898,7 @@
           </w:rPr>
           <w:id w:val="-634264429"/>
           <w14:checkbox>
-            <w14:checked w14:val="0"/>
+            <w14:checked w14:val="1"/>
             <w14:checkedState w14:val="2612" w14:font="MS Gothic"/>
             <w14:uncheckedState w14:val="2610" w14:font="MS Gothic"/>
           </w14:checkbox>
@@ -1897,7 +1909,7 @@
               <w:rFonts w:ascii="MS Gothic" w:eastAsia="MS Gothic" w:hAnsi="MS Gothic" w:hint="eastAsia"/>
               <w:lang w:val="en-US"/>
             </w:rPr>
-            <w:t>☐</w:t>
+            <w:t>☒</w:t>
           </w:r>
         </w:sdtContent>
       </w:sdt>
@@ -1905,7 +1917,19 @@
         <w:rPr>
           <w:lang w:val="en-US"/>
         </w:rPr>
-        <w:t>Provide you own structure</w:t>
+        <w:t>Provide you</w:t>
+      </w:r>
+      <w:r>
+        <w:rPr>
+          <w:lang w:val="en-US"/>
+        </w:rPr>
+        <w:t>r</w:t>
+      </w:r>
+      <w:r>
+        <w:rPr>
+          <w:lang w:val="en-US"/>
+        </w:rPr>
+        <w:t xml:space="preserve"> own structure</w:t>
       </w:r>
     </w:p>
     <w:p>
@@ -1923,7 +1947,7 @@
           </w:rPr>
           <w:id w:val="947970950"/>
           <w14:checkbox>
-            <w14:checked w14:val="0"/>
+            <w14:checked w14:val="1"/>
             <w14:checkedState w14:val="2612" w14:font="MS Gothic"/>
             <w14:uncheckedState w14:val="2610" w14:font="MS Gothic"/>
           </w14:checkbox>
@@ -1934,15 +1958,23 @@
               <w:rFonts w:ascii="MS Gothic" w:eastAsia="MS Gothic" w:hAnsi="MS Gothic" w:hint="eastAsia"/>
               <w:lang w:val="en-US"/>
             </w:rPr>
-            <w:t>☐</w:t>
+            <w:t>☒</w:t>
           </w:r>
         </w:sdtContent>
       </w:sdt>
-      <w:r>
-        <w:rPr>
-          <w:lang w:val="en-US"/>
-        </w:rPr>
-        <w:t>Comment the code (see above)</w:t>
+      <w:proofErr w:type="gramStart"/>
+      <w:r>
+        <w:rPr>
+          <w:lang w:val="en-US"/>
+        </w:rPr>
+        <w:t>Comment</w:t>
+      </w:r>
+      <w:proofErr w:type="gramEnd"/>
+      <w:r>
+        <w:rPr>
+          <w:lang w:val="en-US"/>
+        </w:rPr>
+        <w:t xml:space="preserve"> the code (see above)</w:t>
       </w:r>
     </w:p>
     <w:p>
@@ -1960,7 +1992,7 @@
           </w:rPr>
           <w:id w:val="-502657117"/>
           <w14:checkbox>
-            <w14:checked w14:val="0"/>
+            <w14:checked w14:val="1"/>
             <w14:checkedState w14:val="2612" w14:font="MS Gothic"/>
             <w14:uncheckedState w14:val="2610" w14:font="MS Gothic"/>
           </w14:checkbox>
@@ -1971,7 +2003,7 @@
               <w:rFonts w:ascii="MS Gothic" w:eastAsia="MS Gothic" w:hAnsi="MS Gothic" w:hint="eastAsia"/>
               <w:lang w:val="en-US"/>
             </w:rPr>
-            <w:t>☐</w:t>
+            <w:t>☒</w:t>
           </w:r>
         </w:sdtContent>
       </w:sdt>
@@ -1979,8 +2011,16 @@
         <w:rPr>
           <w:lang w:val="en-US"/>
         </w:rPr>
-        <w:t>Measure space (memory) and time complexity of each heuristics</w:t>
-      </w:r>
+        <w:t xml:space="preserve">Measure space (memory) and time complexity of each </w:t>
+      </w:r>
+      <w:proofErr w:type="gramStart"/>
+      <w:r>
+        <w:rPr>
+          <w:lang w:val="en-US"/>
+        </w:rPr>
+        <w:t>heuristics</w:t>
+      </w:r>
+      <w:proofErr w:type="gramEnd"/>
     </w:p>
     <w:p>
       <w:pPr>
@@ -2408,14 +2448,12 @@
                 <w:lang w:val="en-US"/>
               </w:rPr>
             </w:pPr>
-            <w:proofErr w:type="spellStart"/>
             <w:r>
               <w:rPr>
                 <w:lang w:val="en-US"/>
               </w:rPr>
               <w:t>SlidePuzzleGUI</w:t>
             </w:r>
-            <w:proofErr w:type="spellEnd"/>
           </w:p>
         </w:tc>
       </w:tr>
@@ -2434,7 +2472,6 @@
                 <w:lang w:val="en-US"/>
               </w:rPr>
             </w:pPr>
-            <w:proofErr w:type="spellStart"/>
             <w:r>
               <w:rPr>
                 <w:b w:val="0"/>
@@ -2459,7 +2496,6 @@
               </w:rPr>
               <w:t>bilities</w:t>
             </w:r>
-            <w:proofErr w:type="spellEnd"/>
           </w:p>
         </w:tc>
         <w:tc>
@@ -2478,21 +2514,7 @@
               <w:rPr>
                 <w:lang w:val="en-US"/>
               </w:rPr>
-              <w:t xml:space="preserve">- Handles all user interactions via the </w:t>
-            </w:r>
-            <w:proofErr w:type="spellStart"/>
-            <w:r>
-              <w:rPr>
-                <w:lang w:val="en-US"/>
-              </w:rPr>
-              <w:t>Tkinter</w:t>
-            </w:r>
-            <w:proofErr w:type="spellEnd"/>
-            <w:r>
-              <w:rPr>
-                <w:lang w:val="en-US"/>
-              </w:rPr>
-              <w:t xml:space="preserve"> interface</w:t>
+              <w:t>- Handles all user interactions via the Tkinter interface</w:t>
             </w:r>
             <w:r>
               <w:rPr>
@@ -2551,13 +2573,8 @@
                 <w:lang w:val="en-US"/>
               </w:rPr>
             </w:pPr>
-            <w:proofErr w:type="spellStart"/>
-            <w:r>
-              <w:t>create_widgets</w:t>
-            </w:r>
-            <w:proofErr w:type="spellEnd"/>
-            <w:r>
-              <w:t>()</w:t>
+            <w:r>
+              <w:t>create_widgets()</w:t>
             </w:r>
           </w:p>
         </w:tc>
@@ -2608,19 +2625,25 @@
                 <w:lang w:val="en-US"/>
               </w:rPr>
             </w:pPr>
-            <w:proofErr w:type="spellStart"/>
-            <w:r>
-              <w:rPr>
-                <w:lang w:val="en-US"/>
-              </w:rPr>
-              <w:t>log_message</w:t>
-            </w:r>
-            <w:proofErr w:type="spellEnd"/>
-            <w:r>
-              <w:rPr>
-                <w:lang w:val="en-US"/>
-              </w:rPr>
-              <w:t xml:space="preserve">(message, </w:t>
+            <w:r>
+              <w:rPr>
+                <w:lang w:val="en-US"/>
+              </w:rPr>
+              <w:t>log_</w:t>
+            </w:r>
+            <w:proofErr w:type="gramStart"/>
+            <w:r>
+              <w:rPr>
+                <w:lang w:val="en-US"/>
+              </w:rPr>
+              <w:t>message(</w:t>
+            </w:r>
+            <w:proofErr w:type="gramEnd"/>
+            <w:r>
+              <w:rPr>
+                <w:lang w:val="en-US"/>
+              </w:rPr>
+              <w:t xml:space="preserve">message, </w:t>
             </w:r>
             <w:r>
               <w:rPr>
@@ -2680,13 +2703,8 @@
                 <w:lang w:val="en-US"/>
               </w:rPr>
             </w:pPr>
-            <w:proofErr w:type="spellStart"/>
-            <w:r>
-              <w:t>shuffle_tiles</w:t>
-            </w:r>
-            <w:proofErr w:type="spellEnd"/>
-            <w:r>
-              <w:t>()</w:t>
+            <w:r>
+              <w:t>shuffle_tiles()</w:t>
             </w:r>
           </w:p>
         </w:tc>
@@ -2749,13 +2767,8 @@
                 <w:lang w:val="en-US"/>
               </w:rPr>
             </w:pPr>
-            <w:proofErr w:type="spellStart"/>
-            <w:r>
-              <w:t>move_tile</w:t>
-            </w:r>
-            <w:proofErr w:type="spellEnd"/>
-            <w:r>
-              <w:t>(i, j)</w:t>
+            <w:r>
+              <w:t>move_tile(i, j)</w:t>
             </w:r>
           </w:p>
         </w:tc>
@@ -2809,13 +2822,8 @@
                 <w:lang w:val="en-US"/>
               </w:rPr>
             </w:pPr>
-            <w:proofErr w:type="spellStart"/>
-            <w:r>
-              <w:t>check_win</w:t>
-            </w:r>
-            <w:proofErr w:type="spellEnd"/>
-            <w:r>
-              <w:t>()</w:t>
+            <w:r>
+              <w:t>check_win()</w:t>
             </w:r>
           </w:p>
         </w:tc>
@@ -2878,13 +2886,8 @@
                 <w:lang w:val="en-US"/>
               </w:rPr>
             </w:pPr>
-            <w:proofErr w:type="spellStart"/>
-            <w:r>
-              <w:t>reset_game</w:t>
-            </w:r>
-            <w:proofErr w:type="spellEnd"/>
-            <w:r>
-              <w:t>()</w:t>
+            <w:r>
+              <w:t>reset_game()</w:t>
             </w:r>
           </w:p>
         </w:tc>
@@ -2947,13 +2950,8 @@
             <w:pPr>
               <w:cnfStyle w:val="000000100000" w:firstRow="0" w:lastRow="0" w:firstColumn="0" w:lastColumn="0" w:oddVBand="0" w:evenVBand="0" w:oddHBand="1" w:evenHBand="0" w:firstRowFirstColumn="0" w:firstRowLastColumn="0" w:lastRowFirstColumn="0" w:lastRowLastColumn="0"/>
             </w:pPr>
-            <w:proofErr w:type="spellStart"/>
-            <w:r>
-              <w:t>update_buttons</w:t>
-            </w:r>
-            <w:proofErr w:type="spellEnd"/>
-            <w:r>
-              <w:t>()</w:t>
+            <w:r>
+              <w:t>update_buttons()</w:t>
             </w:r>
           </w:p>
         </w:tc>
@@ -3013,13 +3011,8 @@
             <w:pPr>
               <w:cnfStyle w:val="000000000000" w:firstRow="0" w:lastRow="0" w:firstColumn="0" w:lastColumn="0" w:oddVBand="0" w:evenVBand="0" w:oddHBand="0" w:evenHBand="0" w:firstRowFirstColumn="0" w:firstRowLastColumn="0" w:lastRowFirstColumn="0" w:lastRowLastColumn="0"/>
             </w:pPr>
-            <w:proofErr w:type="spellStart"/>
-            <w:r>
-              <w:t>calculate_heuristics</w:t>
-            </w:r>
-            <w:proofErr w:type="spellEnd"/>
-            <w:r>
-              <w:t>()</w:t>
+            <w:r>
+              <w:t>calculate_heuristics()</w:t>
             </w:r>
           </w:p>
         </w:tc>
@@ -3094,13 +3087,8 @@
             <w:pPr>
               <w:cnfStyle w:val="000000100000" w:firstRow="0" w:lastRow="0" w:firstColumn="0" w:lastColumn="0" w:oddVBand="0" w:evenVBand="0" w:oddHBand="1" w:evenHBand="0" w:firstRowFirstColumn="0" w:firstRowLastColumn="0" w:lastRowFirstColumn="0" w:lastRowLastColumn="0"/>
             </w:pPr>
-            <w:proofErr w:type="spellStart"/>
-            <w:r>
-              <w:t>update_timer</w:t>
-            </w:r>
-            <w:proofErr w:type="spellEnd"/>
-            <w:r>
-              <w:t>()</w:t>
+            <w:r>
+              <w:t>update_timer()</w:t>
             </w:r>
           </w:p>
         </w:tc>
@@ -3255,21 +3243,8 @@
             <w:pPr>
               <w:cnfStyle w:val="000000000000" w:firstRow="0" w:lastRow="0" w:firstColumn="0" w:lastColumn="0" w:oddVBand="0" w:evenVBand="0" w:oddHBand="0" w:evenHBand="0" w:firstRowFirstColumn="0" w:firstRowLastColumn="0" w:lastRowFirstColumn="0" w:lastRowLastColumn="0"/>
             </w:pPr>
-            <w:proofErr w:type="spellStart"/>
-            <w:r>
-              <w:t>run_single_benchmark</w:t>
-            </w:r>
-            <w:proofErr w:type="spellEnd"/>
-            <w:r>
-              <w:t>(</w:t>
-            </w:r>
-            <w:proofErr w:type="spellStart"/>
-            <w:r>
-              <w:t>heuristic</w:t>
-            </w:r>
-            <w:proofErr w:type="spellEnd"/>
-            <w:r>
-              <w:t>)</w:t>
+            <w:r>
+              <w:t>run_single_benchmark(heuristic)</w:t>
             </w:r>
           </w:p>
         </w:tc>
@@ -3323,19 +3298,11 @@
                 <w:lang w:val="en-US"/>
               </w:rPr>
             </w:pPr>
-            <w:proofErr w:type="spellStart"/>
-            <w:r>
-              <w:rPr>
-                <w:lang w:val="en-US"/>
-              </w:rPr>
-              <w:t>find_and_show_solution</w:t>
-            </w:r>
-            <w:proofErr w:type="spellEnd"/>
-            <w:r>
-              <w:rPr>
-                <w:lang w:val="en-US"/>
-              </w:rPr>
-              <w:t>(heuristic)</w:t>
+            <w:r>
+              <w:rPr>
+                <w:lang w:val="en-US"/>
+              </w:rPr>
+              <w:t>find_and_show_solution(heuristic)</w:t>
             </w:r>
           </w:p>
         </w:tc>
@@ -3386,13 +3353,8 @@
                 <w:lang w:val="en-US"/>
               </w:rPr>
             </w:pPr>
-            <w:proofErr w:type="spellStart"/>
-            <w:r>
-              <w:t>animate_solution</w:t>
-            </w:r>
-            <w:proofErr w:type="spellEnd"/>
-            <w:r>
-              <w:t>()</w:t>
+            <w:r>
+              <w:t>animate_solution()</w:t>
             </w:r>
           </w:p>
         </w:tc>
@@ -3549,7 +3511,6 @@
                 <w:lang w:val="en-US"/>
               </w:rPr>
             </w:pPr>
-            <w:proofErr w:type="spellStart"/>
             <w:r>
               <w:rPr>
                 <w:b w:val="0"/>
@@ -3574,7 +3535,6 @@
               </w:rPr>
               <w:t>bilities</w:t>
             </w:r>
-            <w:proofErr w:type="spellEnd"/>
           </w:p>
         </w:tc>
         <w:tc>
@@ -3647,21 +3607,8 @@
             <w:pPr>
               <w:cnfStyle w:val="000000100000" w:firstRow="0" w:lastRow="0" w:firstColumn="0" w:lastColumn="0" w:oddVBand="0" w:evenVBand="0" w:oddHBand="1" w:evenHBand="0" w:firstRowFirstColumn="0" w:firstRowLastColumn="0" w:lastRowFirstColumn="0" w:lastRowLastColumn="0"/>
             </w:pPr>
-            <w:proofErr w:type="spellStart"/>
-            <w:r>
-              <w:t>flatten</w:t>
-            </w:r>
-            <w:proofErr w:type="spellEnd"/>
-            <w:r>
-              <w:t>(</w:t>
-            </w:r>
-            <w:proofErr w:type="spellStart"/>
-            <w:r>
-              <w:t>state</w:t>
-            </w:r>
-            <w:proofErr w:type="spellEnd"/>
-            <w:r>
-              <w:t>)</w:t>
+            <w:r>
+              <w:t>flatten(state)</w:t>
             </w:r>
           </w:p>
         </w:tc>
@@ -3715,13 +3662,8 @@
                 <w:lang w:val="en-US"/>
               </w:rPr>
             </w:pPr>
-            <w:proofErr w:type="spellStart"/>
-            <w:r>
-              <w:t>generateRandomSolvableBoard</w:t>
-            </w:r>
-            <w:proofErr w:type="spellEnd"/>
-            <w:r>
-              <w:t>()</w:t>
+            <w:r>
+              <w:t>generateRandomSolvableBoard()</w:t>
             </w:r>
           </w:p>
         </w:tc>
@@ -3775,21 +3717,8 @@
                 <w:lang w:val="en-US"/>
               </w:rPr>
             </w:pPr>
-            <w:proofErr w:type="spellStart"/>
-            <w:r>
-              <w:t>isSolvable</w:t>
-            </w:r>
-            <w:proofErr w:type="spellEnd"/>
-            <w:r>
-              <w:t>(</w:t>
-            </w:r>
-            <w:proofErr w:type="spellStart"/>
-            <w:r>
-              <w:t>state</w:t>
-            </w:r>
-            <w:proofErr w:type="spellEnd"/>
-            <w:r>
-              <w:t>)</w:t>
+            <w:r>
+              <w:t>isSolvable(state)</w:t>
             </w:r>
           </w:p>
         </w:tc>
@@ -3841,21 +3770,8 @@
                 <w:lang w:val="en-US"/>
               </w:rPr>
             </w:pPr>
-            <w:proofErr w:type="spellStart"/>
-            <w:r>
-              <w:t>neighbors</w:t>
-            </w:r>
-            <w:proofErr w:type="spellEnd"/>
-            <w:r>
-              <w:t>(</w:t>
-            </w:r>
-            <w:proofErr w:type="spellStart"/>
-            <w:r>
-              <w:t>state</w:t>
-            </w:r>
-            <w:proofErr w:type="spellEnd"/>
-            <w:r>
-              <w:t>)</w:t>
+            <w:r>
+              <w:t>neighbors(state)</w:t>
             </w:r>
           </w:p>
         </w:tc>
@@ -3909,29 +3825,8 @@
                 <w:lang w:val="en-US"/>
               </w:rPr>
             </w:pPr>
-            <w:proofErr w:type="spellStart"/>
-            <w:r>
-              <w:t>calculateCosts</w:t>
-            </w:r>
-            <w:proofErr w:type="spellEnd"/>
-            <w:r>
-              <w:t>(</w:t>
-            </w:r>
-            <w:proofErr w:type="spellStart"/>
-            <w:r>
-              <w:t>state</w:t>
-            </w:r>
-            <w:proofErr w:type="spellEnd"/>
-            <w:r>
-              <w:t xml:space="preserve">, g, </w:t>
-            </w:r>
-            <w:proofErr w:type="spellStart"/>
-            <w:r>
-              <w:t>heuristic</w:t>
-            </w:r>
-            <w:proofErr w:type="spellEnd"/>
-            <w:r>
-              <w:t>)</w:t>
+            <w:r>
+              <w:t>calculateCosts(state, g, heuristic)</w:t>
             </w:r>
           </w:p>
         </w:tc>
@@ -3983,68 +3878,47 @@
                 <w:lang w:val="en-US"/>
               </w:rPr>
             </w:pPr>
-            <w:proofErr w:type="spellStart"/>
-            <w:r>
-              <w:t>solve</w:t>
-            </w:r>
-            <w:proofErr w:type="spellEnd"/>
-            <w:r>
-              <w:t>(</w:t>
-            </w:r>
-            <w:proofErr w:type="spellStart"/>
-            <w:r>
-              <w:t>startState</w:t>
-            </w:r>
-            <w:proofErr w:type="spellEnd"/>
-            <w:r>
+            <w:r>
+              <w:t>solve(startState, goalState, heuristic)</w:t>
+            </w:r>
+          </w:p>
+        </w:tc>
+        <w:tc>
+          <w:tcPr>
+            <w:tcW w:w="5812" w:type="dxa"/>
+          </w:tcPr>
+          <w:p>
+            <w:pPr>
+              <w:cnfStyle w:val="000000000000" w:firstRow="0" w:lastRow="0" w:firstColumn="0" w:lastColumn="0" w:oddVBand="0" w:evenVBand="0" w:oddHBand="0" w:evenHBand="0" w:firstRowFirstColumn="0" w:firstRowLastColumn="0" w:lastRowFirstColumn="0" w:lastRowLastColumn="0"/>
+              <w:rPr>
+                <w:lang w:val="en-US"/>
+              </w:rPr>
+            </w:pPr>
+            <w:r>
+              <w:rPr>
+                <w:lang w:val="en-US"/>
+              </w:rPr>
+              <w:t>Performs A* search</w:t>
+            </w:r>
+            <w:r>
+              <w:rPr>
+                <w:lang w:val="en-US"/>
+              </w:rPr>
               <w:t xml:space="preserve">, </w:t>
             </w:r>
-            <w:proofErr w:type="spellStart"/>
-            <w:r>
-              <w:t>goalState</w:t>
-            </w:r>
-            <w:proofErr w:type="spellEnd"/>
-            <w:r>
-              <w:t xml:space="preserve">, </w:t>
-            </w:r>
-            <w:proofErr w:type="spellStart"/>
-            <w:r>
-              <w:t>heuristic</w:t>
-            </w:r>
-            <w:proofErr w:type="spellEnd"/>
-            <w:r>
-              <w:t>)</w:t>
-            </w:r>
-          </w:p>
-        </w:tc>
-        <w:tc>
-          <w:tcPr>
-            <w:tcW w:w="5812" w:type="dxa"/>
-          </w:tcPr>
-          <w:p>
-            <w:pPr>
-              <w:cnfStyle w:val="000000000000" w:firstRow="0" w:lastRow="0" w:firstColumn="0" w:lastColumn="0" w:oddVBand="0" w:evenVBand="0" w:oddHBand="0" w:evenHBand="0" w:firstRowFirstColumn="0" w:firstRowLastColumn="0" w:lastRowFirstColumn="0" w:lastRowLastColumn="0"/>
-              <w:rPr>
-                <w:lang w:val="en-US"/>
-              </w:rPr>
-            </w:pPr>
-            <w:r>
-              <w:rPr>
-                <w:lang w:val="en-US"/>
-              </w:rPr>
-              <w:t>Performs A* search</w:t>
-            </w:r>
-            <w:r>
-              <w:rPr>
-                <w:lang w:val="en-US"/>
-              </w:rPr>
-              <w:t xml:space="preserve">, </w:t>
-            </w:r>
-            <w:r>
-              <w:rPr>
-                <w:lang w:val="en-US"/>
-              </w:rPr>
-              <w:t>returns path and expanded node count</w:t>
+            <w:proofErr w:type="gramStart"/>
+            <w:r>
+              <w:rPr>
+                <w:lang w:val="en-US"/>
+              </w:rPr>
+              <w:t>returns</w:t>
+            </w:r>
+            <w:proofErr w:type="gramEnd"/>
+            <w:r>
+              <w:rPr>
+                <w:lang w:val="en-US"/>
+              </w:rPr>
+              <w:t xml:space="preserve"> path and expanded node count</w:t>
             </w:r>
           </w:p>
         </w:tc>
@@ -4079,13 +3953,8 @@
                 <w:lang w:val="en-US"/>
               </w:rPr>
             </w:pPr>
-            <w:proofErr w:type="spellStart"/>
-            <w:r>
-              <w:t>runBenchmark</w:t>
-            </w:r>
-            <w:proofErr w:type="spellEnd"/>
-            <w:r>
-              <w:t>()</w:t>
+            <w:r>
+              <w:t>runBenchmark()</w:t>
             </w:r>
           </w:p>
         </w:tc>
@@ -4104,21 +3973,7 @@
               <w:rPr>
                 <w:lang w:val="en-US"/>
               </w:rPr>
-              <w:t>Runs 100 random boards for both heuristics and logs mean/</w:t>
-            </w:r>
-            <w:proofErr w:type="spellStart"/>
-            <w:r>
-              <w:rPr>
-                <w:lang w:val="en-US"/>
-              </w:rPr>
-              <w:t>stdev</w:t>
-            </w:r>
-            <w:proofErr w:type="spellEnd"/>
-            <w:r>
-              <w:rPr>
-                <w:lang w:val="en-US"/>
-              </w:rPr>
-              <w:t xml:space="preserve"> results</w:t>
+              <w:t>Runs 100 random boards for both heuristics and logs mean/stdev results</w:t>
             </w:r>
           </w:p>
         </w:tc>
@@ -4235,11 +4090,9 @@
                 <w:lang w:val="en-US"/>
               </w:rPr>
             </w:pPr>
-            <w:proofErr w:type="spellStart"/>
             <w:r>
               <w:t>Heuristics</w:t>
             </w:r>
-            <w:proofErr w:type="spellEnd"/>
           </w:p>
         </w:tc>
       </w:tr>
@@ -4258,7 +4111,6 @@
                 <w:lang w:val="en-US"/>
               </w:rPr>
             </w:pPr>
-            <w:proofErr w:type="spellStart"/>
             <w:r>
               <w:rPr>
                 <w:b w:val="0"/>
@@ -4283,7 +4135,6 @@
               </w:rPr>
               <w:t>bilities</w:t>
             </w:r>
-            <w:proofErr w:type="spellEnd"/>
           </w:p>
         </w:tc>
         <w:tc>
@@ -4357,23 +4208,7 @@
               <w:cnfStyle w:val="000000100000" w:firstRow="0" w:lastRow="0" w:firstColumn="0" w:lastColumn="0" w:oddVBand="0" w:evenVBand="0" w:oddHBand="1" w:evenHBand="0" w:firstRowFirstColumn="0" w:firstRowLastColumn="0" w:lastRowFirstColumn="0" w:lastRowLastColumn="0"/>
             </w:pPr>
             <w:r>
-              <w:t>__</w:t>
-            </w:r>
-            <w:proofErr w:type="spellStart"/>
-            <w:r>
-              <w:t>init</w:t>
-            </w:r>
-            <w:proofErr w:type="spellEnd"/>
-            <w:r>
-              <w:t>__(</w:t>
-            </w:r>
-            <w:proofErr w:type="spellStart"/>
-            <w:r>
-              <w:t>goalState</w:t>
-            </w:r>
-            <w:proofErr w:type="spellEnd"/>
-            <w:r>
-              <w:t>)</w:t>
+              <w:t>__init__(goalState)</w:t>
             </w:r>
           </w:p>
         </w:tc>
@@ -4388,11 +4223,19 @@
                 <w:lang w:val="en-US"/>
               </w:rPr>
             </w:pPr>
-            <w:r>
-              <w:rPr>
-                <w:lang w:val="en-US"/>
-              </w:rPr>
-              <w:t>Stores goal positions of each tile for quick lookup.</w:t>
+            <w:proofErr w:type="gramStart"/>
+            <w:r>
+              <w:rPr>
+                <w:lang w:val="en-US"/>
+              </w:rPr>
+              <w:t>Stores</w:t>
+            </w:r>
+            <w:proofErr w:type="gramEnd"/>
+            <w:r>
+              <w:rPr>
+                <w:lang w:val="en-US"/>
+              </w:rPr>
+              <w:t xml:space="preserve"> goal positions of each tile for quick lookup.</w:t>
             </w:r>
           </w:p>
         </w:tc>
@@ -4428,23 +4271,7 @@
               </w:rPr>
             </w:pPr>
             <w:r>
-              <w:t>_</w:t>
-            </w:r>
-            <w:proofErr w:type="spellStart"/>
-            <w:r>
-              <w:t>validate_state</w:t>
-            </w:r>
-            <w:proofErr w:type="spellEnd"/>
-            <w:r>
-              <w:t>(</w:t>
-            </w:r>
-            <w:proofErr w:type="spellStart"/>
-            <w:r>
-              <w:t>state</w:t>
-            </w:r>
-            <w:proofErr w:type="spellEnd"/>
-            <w:r>
-              <w:t>)</w:t>
+              <w:t>_validate_state(state)</w:t>
             </w:r>
           </w:p>
         </w:tc>
@@ -4498,21 +4325,8 @@
                 <w:lang w:val="en-US"/>
               </w:rPr>
             </w:pPr>
-            <w:proofErr w:type="spellStart"/>
-            <w:r>
-              <w:t>manhattan</w:t>
-            </w:r>
-            <w:proofErr w:type="spellEnd"/>
-            <w:r>
-              <w:t>(</w:t>
-            </w:r>
-            <w:proofErr w:type="spellStart"/>
-            <w:r>
-              <w:t>state</w:t>
-            </w:r>
-            <w:proofErr w:type="spellEnd"/>
-            <w:r>
-              <w:t>)</w:t>
+            <w:r>
+              <w:t>manhattan(state)</w:t>
             </w:r>
           </w:p>
         </w:tc>
@@ -4564,21 +4378,8 @@
                 <w:lang w:val="en-US"/>
               </w:rPr>
             </w:pPr>
-            <w:proofErr w:type="spellStart"/>
-            <w:r>
-              <w:t>hamming</w:t>
-            </w:r>
-            <w:proofErr w:type="spellEnd"/>
-            <w:r>
-              <w:t>(</w:t>
-            </w:r>
-            <w:proofErr w:type="spellStart"/>
-            <w:r>
-              <w:t>state</w:t>
-            </w:r>
-            <w:proofErr w:type="spellEnd"/>
-            <w:r>
-              <w:t>)</w:t>
+            <w:r>
+              <w:t>hamming(state)</w:t>
             </w:r>
           </w:p>
         </w:tc>
@@ -4679,19 +4480,11 @@
                 <w:lang w:val="en-US"/>
               </w:rPr>
             </w:pPr>
-            <w:proofErr w:type="spellStart"/>
             <w:r>
               <w:rPr>
                 <w:color w:val="FFFFFF" w:themeColor="background1"/>
               </w:rPr>
-              <w:t>SlidePuzzleGUI</w:t>
-            </w:r>
-            <w:proofErr w:type="spellEnd"/>
-            <w:r>
-              <w:rPr>
-                <w:color w:val="FFFFFF" w:themeColor="background1"/>
-              </w:rPr>
-              <w:t xml:space="preserve"> </w:t>
+              <w:t xml:space="preserve">SlidePuzzleGUI </w:t>
             </w:r>
             <w:r>
               <w:rPr>
@@ -4733,7 +4526,7 @@
               </w:rPr>
               <w:t xml:space="preserve">GUI calls </w:t>
             </w:r>
-            <w:proofErr w:type="spellStart"/>
+            <w:proofErr w:type="gramStart"/>
             <w:r>
               <w:rPr>
                 <w:b w:val="0"/>
@@ -4744,7 +4537,7 @@
               </w:rPr>
               <w:t>solver.solve</w:t>
             </w:r>
-            <w:proofErr w:type="spellEnd"/>
+            <w:proofErr w:type="gramEnd"/>
             <w:r>
               <w:rPr>
                 <w:b w:val="0"/>
@@ -4763,7 +4556,7 @@
               </w:rPr>
               <w:t xml:space="preserve"> or </w:t>
             </w:r>
-            <w:proofErr w:type="spellStart"/>
+            <w:proofErr w:type="gramStart"/>
             <w:r>
               <w:rPr>
                 <w:b w:val="0"/>
@@ -4774,7 +4567,7 @@
               </w:rPr>
               <w:t>solver.runBenchmark</w:t>
             </w:r>
-            <w:proofErr w:type="spellEnd"/>
+            <w:proofErr w:type="gramEnd"/>
             <w:r>
               <w:rPr>
                 <w:b w:val="0"/>
@@ -4848,16 +4641,8 @@
               <w:rPr>
                 <w:color w:val="FFFFFF" w:themeColor="background1"/>
               </w:rPr>
-              <w:t xml:space="preserve"> </w:t>
-            </w:r>
-            <w:proofErr w:type="spellStart"/>
-            <w:r>
-              <w:rPr>
-                <w:color w:val="FFFFFF" w:themeColor="background1"/>
-              </w:rPr>
-              <w:t>Heuristics</w:t>
-            </w:r>
-            <w:proofErr w:type="spellEnd"/>
+              <w:t xml:space="preserve"> Heuristics</w:t>
+            </w:r>
           </w:p>
         </w:tc>
       </w:tr>
@@ -4892,7 +4677,7 @@
                 <w:lang w:val="en-US"/>
               </w:rPr>
             </w:pPr>
-            <w:proofErr w:type="spellStart"/>
+            <w:proofErr w:type="gramStart"/>
             <w:r>
               <w:rPr>
                 <w:b w:val="0"/>
@@ -4903,7 +4688,7 @@
               </w:rPr>
               <w:t>heuristic.manhattan</w:t>
             </w:r>
-            <w:proofErr w:type="spellEnd"/>
+            <w:proofErr w:type="gramEnd"/>
             <w:r>
               <w:rPr>
                 <w:b w:val="0"/>
@@ -4930,7 +4715,7 @@
               </w:rPr>
               <w:t xml:space="preserve"> </w:t>
             </w:r>
-            <w:proofErr w:type="spellStart"/>
+            <w:proofErr w:type="gramStart"/>
             <w:r>
               <w:rPr>
                 <w:b w:val="0"/>
@@ -4941,7 +4726,7 @@
               </w:rPr>
               <w:t>heuristic.hamming</w:t>
             </w:r>
-            <w:proofErr w:type="spellEnd"/>
+            <w:proofErr w:type="gramEnd"/>
             <w:r>
               <w:rPr>
                 <w:b w:val="0"/>
@@ -5149,14 +4934,12 @@
                 <w:color w:val="FFFFFF" w:themeColor="background1"/>
               </w:rPr>
             </w:pPr>
-            <w:proofErr w:type="spellStart"/>
             <w:r>
               <w:rPr>
                 <w:color w:val="FFFFFF" w:themeColor="background1"/>
               </w:rPr>
               <w:t>Direction</w:t>
             </w:r>
-            <w:proofErr w:type="spellEnd"/>
           </w:p>
         </w:tc>
         <w:tc>
@@ -5174,23 +4957,21 @@
                 <w:color w:val="FFFFFF" w:themeColor="background1"/>
               </w:rPr>
             </w:pPr>
-            <w:proofErr w:type="spellStart"/>
             <w:r>
               <w:rPr>
                 <w:b/>
                 <w:bCs/>
                 <w:color w:val="FFFFFF" w:themeColor="background1"/>
               </w:rPr>
-              <w:t>From</w:t>
-            </w:r>
-            <w:proofErr w:type="spellEnd"/>
+              <w:t xml:space="preserve">From </w:t>
+            </w:r>
             <w:r>
               <w:rPr>
                 <w:b/>
                 <w:bCs/>
                 <w:color w:val="FFFFFF" w:themeColor="background1"/>
               </w:rPr>
-              <w:t xml:space="preserve"> </w:t>
+              <w:sym w:font="Wingdings" w:char="F0E0"/>
             </w:r>
             <w:r>
               <w:rPr>
@@ -5198,68 +4979,32 @@
                 <w:bCs/>
                 <w:color w:val="FFFFFF" w:themeColor="background1"/>
               </w:rPr>
-              <w:sym w:font="Wingdings" w:char="F0E0"/>
-            </w:r>
-            <w:r>
+              <w:t xml:space="preserve"> To</w:t>
+            </w:r>
+          </w:p>
+        </w:tc>
+        <w:tc>
+          <w:tcPr>
+            <w:tcW w:w="5098" w:type="dxa"/>
+            <w:shd w:val="clear" w:color="auto" w:fill="156082" w:themeFill="accent1"/>
+          </w:tcPr>
+          <w:p>
+            <w:pPr>
+              <w:jc w:val="center"/>
+              <w:cnfStyle w:val="000000100000" w:firstRow="0" w:lastRow="0" w:firstColumn="0" w:lastColumn="0" w:oddVBand="0" w:evenVBand="0" w:oddHBand="1" w:evenHBand="0" w:firstRowFirstColumn="0" w:firstRowLastColumn="0" w:lastRowFirstColumn="0" w:lastRowLastColumn="0"/>
               <w:rPr>
                 <w:b/>
                 <w:bCs/>
                 <w:color w:val="FFFFFF" w:themeColor="background1"/>
               </w:rPr>
-              <w:t xml:space="preserve"> </w:t>
-            </w:r>
-            <w:proofErr w:type="spellStart"/>
+            </w:pPr>
             <w:r>
               <w:rPr>
                 <w:b/>
                 <w:bCs/>
                 <w:color w:val="FFFFFF" w:themeColor="background1"/>
               </w:rPr>
-              <w:t>To</w:t>
-            </w:r>
-            <w:proofErr w:type="spellEnd"/>
-          </w:p>
-        </w:tc>
-        <w:tc>
-          <w:tcPr>
-            <w:tcW w:w="5098" w:type="dxa"/>
-            <w:shd w:val="clear" w:color="auto" w:fill="156082" w:themeFill="accent1"/>
-          </w:tcPr>
-          <w:p>
-            <w:pPr>
-              <w:jc w:val="center"/>
-              <w:cnfStyle w:val="000000100000" w:firstRow="0" w:lastRow="0" w:firstColumn="0" w:lastColumn="0" w:oddVBand="0" w:evenVBand="0" w:oddHBand="1" w:evenHBand="0" w:firstRowFirstColumn="0" w:firstRowLastColumn="0" w:lastRowFirstColumn="0" w:lastRowLastColumn="0"/>
-              <w:rPr>
-                <w:b/>
-                <w:bCs/>
-                <w:color w:val="FFFFFF" w:themeColor="background1"/>
-              </w:rPr>
-            </w:pPr>
-            <w:r>
-              <w:rPr>
-                <w:b/>
-                <w:bCs/>
-                <w:color w:val="FFFFFF" w:themeColor="background1"/>
-              </w:rPr>
-              <w:t xml:space="preserve">Type </w:t>
-            </w:r>
-            <w:proofErr w:type="spellStart"/>
-            <w:r>
-              <w:rPr>
-                <w:b/>
-                <w:bCs/>
-                <w:color w:val="FFFFFF" w:themeColor="background1"/>
-              </w:rPr>
-              <w:t>of</w:t>
-            </w:r>
-            <w:proofErr w:type="spellEnd"/>
-            <w:r>
-              <w:rPr>
-                <w:b/>
-                <w:bCs/>
-                <w:color w:val="FFFFFF" w:themeColor="background1"/>
-              </w:rPr>
-              <w:t xml:space="preserve"> Interaction</w:t>
+              <w:t>Type of Interaction</w:t>
             </w:r>
           </w:p>
         </w:tc>
@@ -5658,21 +5403,7 @@
         <w:rPr>
           <w:lang w:val="en-US"/>
         </w:rPr>
-        <w:t xml:space="preserve"> (</w:t>
-      </w:r>
-      <w:proofErr w:type="spellStart"/>
-      <w:r>
-        <w:rPr>
-          <w:lang w:val="en-US"/>
-        </w:rPr>
-        <w:t>manhattan</w:t>
-      </w:r>
-      <w:proofErr w:type="spellEnd"/>
-      <w:r>
-        <w:rPr>
-          <w:lang w:val="en-US"/>
-        </w:rPr>
-        <w:t>/hamming)</w:t>
+        <w:t xml:space="preserve"> (manhattan/hamming)</w:t>
       </w:r>
       <w:r>
         <w:rPr>
@@ -5712,8 +5443,16 @@
         <w:rPr>
           <w:lang w:val="en-US"/>
         </w:rPr>
-        <w:t xml:space="preserve"> was chosen because it is simple and has all required libraries built-in.</w:t>
-      </w:r>
+        <w:t xml:space="preserve"> was chosen because it is simple and has all required libraries </w:t>
+      </w:r>
+      <w:proofErr w:type="gramStart"/>
+      <w:r>
+        <w:rPr>
+          <w:lang w:val="en-US"/>
+        </w:rPr>
+        <w:t>built-in.</w:t>
+      </w:r>
+      <w:proofErr w:type="gramEnd"/>
       <w:r>
         <w:rPr>
           <w:lang w:val="en-US"/>
@@ -5726,7 +5465,6 @@
         </w:rPr>
         <w:t xml:space="preserve">The </w:t>
       </w:r>
-      <w:proofErr w:type="spellStart"/>
       <w:r>
         <w:rPr>
           <w:i/>
@@ -5735,7 +5473,6 @@
         </w:rPr>
         <w:t>Tkinter</w:t>
       </w:r>
-      <w:proofErr w:type="spellEnd"/>
       <w:r>
         <w:rPr>
           <w:lang w:val="en-US"/>
@@ -5993,7 +5730,25 @@
           <w:bCs/>
           <w:lang w:val="en-US"/>
         </w:rPr>
-        <w:t>Provide a table with complexity comparisons of different heuristics</w:t>
+        <w:t xml:space="preserve">Provide a table with </w:t>
+      </w:r>
+      <w:proofErr w:type="gramStart"/>
+      <w:r>
+        <w:rPr>
+          <w:b/>
+          <w:bCs/>
+          <w:lang w:val="en-US"/>
+        </w:rPr>
+        <w:t>complexity</w:t>
+      </w:r>
+      <w:proofErr w:type="gramEnd"/>
+      <w:r>
+        <w:rPr>
+          <w:b/>
+          <w:bCs/>
+          <w:lang w:val="en-US"/>
+        </w:rPr>
+        <w:t xml:space="preserve"> comparisons of different heuristics</w:t>
       </w:r>
     </w:p>
     <w:tbl>
@@ -6193,25 +5948,7 @@
                 <w:szCs w:val="21"/>
                 <w:lang w:val="en-US"/>
               </w:rPr>
-              <w:t xml:space="preserve">For an </w:t>
-            </w:r>
-            <w:proofErr w:type="spellStart"/>
-            <w:r>
-              <w:rPr>
-                <w:sz w:val="21"/>
-                <w:szCs w:val="21"/>
-                <w:lang w:val="en-US"/>
-              </w:rPr>
-              <w:t>n×n</w:t>
-            </w:r>
-            <w:proofErr w:type="spellEnd"/>
-            <w:r>
-              <w:rPr>
-                <w:sz w:val="21"/>
-                <w:szCs w:val="21"/>
-                <w:lang w:val="en-US"/>
-              </w:rPr>
-              <w:t xml:space="preserve"> puzzle (e.g., 3×3 → n=3), you have n² tiles</w:t>
+              <w:t>For an n×n puzzle (e.g., 3×3 → n=3), you have n² tiles</w:t>
             </w:r>
           </w:p>
           <w:p>
@@ -6288,39 +6025,7 @@
                 <w:sz w:val="21"/>
                 <w:szCs w:val="21"/>
               </w:rPr>
-              <w:t xml:space="preserve">This </w:t>
-            </w:r>
-            <w:proofErr w:type="spellStart"/>
-            <w:r>
-              <w:rPr>
-                <w:sz w:val="21"/>
-                <w:szCs w:val="21"/>
-              </w:rPr>
-              <w:t>is</w:t>
-            </w:r>
-            <w:proofErr w:type="spellEnd"/>
-            <w:r>
-              <w:rPr>
-                <w:sz w:val="21"/>
-                <w:szCs w:val="21"/>
-              </w:rPr>
-              <w:t xml:space="preserve"> </w:t>
-            </w:r>
-            <w:proofErr w:type="spellStart"/>
-            <w:r>
-              <w:rPr>
-                <w:sz w:val="21"/>
-                <w:szCs w:val="21"/>
-              </w:rPr>
-              <w:t>very</w:t>
-            </w:r>
-            <w:proofErr w:type="spellEnd"/>
-            <w:r>
-              <w:rPr>
-                <w:sz w:val="21"/>
-                <w:szCs w:val="21"/>
-              </w:rPr>
-              <w:t xml:space="preserve"> fast</w:t>
+              <w:t>This is very fast</w:t>
             </w:r>
           </w:p>
         </w:tc>
@@ -6816,7 +6521,29 @@
                 <w:szCs w:val="21"/>
                 <w:lang w:val="en-US"/>
               </w:rPr>
-              <w:t>In simple terms, it describes how the memory usage grows when the size of the input increases.</w:t>
+              <w:t xml:space="preserve">In simple terms, it describes how </w:t>
+            </w:r>
+            <w:proofErr w:type="gramStart"/>
+            <w:r>
+              <w:rPr>
+                <w:b w:val="0"/>
+                <w:bCs w:val="0"/>
+                <w:sz w:val="21"/>
+                <w:szCs w:val="21"/>
+                <w:lang w:val="en-US"/>
+              </w:rPr>
+              <w:t>the memory</w:t>
+            </w:r>
+            <w:proofErr w:type="gramEnd"/>
+            <w:r>
+              <w:rPr>
+                <w:b w:val="0"/>
+                <w:bCs w:val="0"/>
+                <w:sz w:val="21"/>
+                <w:szCs w:val="21"/>
+                <w:lang w:val="en-US"/>
+              </w:rPr>
+              <w:t xml:space="preserve"> usage grows when the size of the input increases.</w:t>
             </w:r>
           </w:p>
           <w:p>
@@ -6852,13 +6579,23 @@
                 <w:lang w:val="en-US"/>
               </w:rPr>
             </w:pPr>
+            <w:proofErr w:type="gramStart"/>
             <w:r>
               <w:rPr>
                 <w:sz w:val="21"/>
                 <w:szCs w:val="21"/>
                 <w:lang w:val="en-US"/>
               </w:rPr>
-              <w:t>O(1) Complexity:</w:t>
+              <w:t>O(</w:t>
+            </w:r>
+            <w:proofErr w:type="gramEnd"/>
+            <w:r>
+              <w:rPr>
+                <w:sz w:val="21"/>
+                <w:szCs w:val="21"/>
+                <w:lang w:val="en-US"/>
+              </w:rPr>
+              <w:t>1) Complexity:</w:t>
             </w:r>
             <w:r>
               <w:rPr>
@@ -6938,7 +6675,29 @@
                 <w:szCs w:val="21"/>
                 <w:lang w:val="en-US"/>
               </w:rPr>
-              <w:t>For example, when only a few counters or variables are used to process data one piece at a time, the space complexity is O(1).</w:t>
+              <w:t xml:space="preserve">For example, when only a few counters or variables are used to process data one piece at a time, the space complexity is </w:t>
+            </w:r>
+            <w:proofErr w:type="gramStart"/>
+            <w:r>
+              <w:rPr>
+                <w:b w:val="0"/>
+                <w:bCs w:val="0"/>
+                <w:sz w:val="21"/>
+                <w:szCs w:val="21"/>
+                <w:lang w:val="en-US"/>
+              </w:rPr>
+              <w:t>O(</w:t>
+            </w:r>
+            <w:proofErr w:type="gramEnd"/>
+            <w:r>
+              <w:rPr>
+                <w:b w:val="0"/>
+                <w:bCs w:val="0"/>
+                <w:sz w:val="21"/>
+                <w:szCs w:val="21"/>
+                <w:lang w:val="en-US"/>
+              </w:rPr>
+              <w:t>1).</w:t>
             </w:r>
           </w:p>
           <w:p>
@@ -7597,21 +7356,8 @@
               </w:rPr>
             </w:pPr>
             <w:r>
-              <w:t xml:space="preserve">Counts </w:t>
-            </w:r>
-            <w:proofErr w:type="spellStart"/>
-            <w:r>
-              <w:t>misplaced</w:t>
-            </w:r>
-            <w:proofErr w:type="spellEnd"/>
-            <w:r>
-              <w:t xml:space="preserve"> </w:t>
-            </w:r>
-            <w:proofErr w:type="spellStart"/>
-            <w:r>
-              <w:t>tiles</w:t>
-            </w:r>
-            <w:proofErr w:type="spellEnd"/>
+              <w:t>Counts misplaced tiles</w:t>
+            </w:r>
           </w:p>
         </w:tc>
         <w:tc>

</xml_diff>